<commit_message>
Expand Fix #12 report as shareable review document for stakeholders
Co-authored-by: Sonic-Media <Sonic-Media@users.noreply.github.com>
</commit_message>
<xml_diff>
--- a/docs/PHASE-1-FIX-12-BRANCH-SELECTION-AUTHORITY.docx
+++ b/docs/PHASE-1-FIX-12-BRANCH-SELECTION-AUTHORITY.docx
@@ -7,19 +7,58 @@
         <w:pStyle w:val="Heading1"/>
       </w:pPr>
       <w:r>
-        <w:t>PHASE 1 FIX #12 REPORT</w:t>
+        <w:t>SONIC OS — PHASE 1 FIX #12 REPORT</w:t>
       </w:r>
     </w:p>
     <w:p>
       <w:r>
-        <w:t>Generated: 2026-09-10 22:48 UTC</w:t>
+        <w:rPr>
+          <w:b w:val="0"/>
+        </w:rPr>
+        <w:t>Date: 2026-09-11 06:42 UTC</w:t>
       </w:r>
     </w:p>
     <w:p>
       <w:r>
+        <w:rPr>
+          <w:b w:val="0"/>
+        </w:rPr>
+        <w:t>Milestone: Data Integrity — Server-Authoritative Active Branch</w:t>
+      </w:r>
+    </w:p>
+    <w:p>
+      <w:r>
+        <w:rPr>
+          <w:b w:val="0"/>
+        </w:rPr>
         <w:t>Branch: cursor/branch-selection-authority-b6e7</w:t>
       </w:r>
     </w:p>
+    <w:p>
+      <w:r>
+        <w:rPr>
+          <w:b w:val="0"/>
+        </w:rPr>
+        <w:t>Commit: 86fe9ea</w:t>
+      </w:r>
+    </w:p>
+    <w:p>
+      <w:r>
+        <w:rPr>
+          <w:b w:val="0"/>
+        </w:rPr>
+        <w:t>Pull Request: https://github.com/Sonic-Media/sonic-os/pull/22</w:t>
+      </w:r>
+    </w:p>
+    <w:p>
+      <w:r>
+        <w:rPr>
+          <w:b/>
+        </w:rPr>
+        <w:t>Final status: PASS</w:t>
+      </w:r>
+    </w:p>
+    <w:p/>
     <w:p>
       <w:pPr>
         <w:pStyle w:val="Heading2"/>
@@ -31,9 +70,9 @@
     <w:p>
       <w:r>
         <w:rPr>
-          <w:b/>
+          <w:b w:val="0"/>
         </w:rPr>
-        <w:t>PASS</w:t>
+        <w:t>PASS — Server/session branch preference is now authoritative. localStorage no longer overrides PostgreSQL UserPreference.activeBranchCode.</w:t>
       </w:r>
     </w:p>
     <w:p>
@@ -46,7 +85,10 @@
     </w:p>
     <w:p>
       <w:r>
-        <w:t>Medium Finding #12 — Branch selection uses localStorage fallback. When localStorage and PostgreSQL UserPreference.activeBranchCode disagree, the client could treat stale localStorage as authoritative, causing branch-scoped business data to load under the wrong branch.</w:t>
+        <w:rPr>
+          <w:b w:val="0"/>
+        </w:rPr>
+        <w:t>Medium Finding #12 — Branch selection uses localStorage fallback. When localStorage and PostgreSQL UserPreference.activeBranchCode disagreed, the client could treat stale localStorage as authoritative, causing branch-scoped business data to load under the wrong branch.</w:t>
       </w:r>
     </w:p>
     <w:p>
@@ -59,7 +101,10 @@
     </w:p>
     <w:p>
       <w:r>
-        <w:t>BranchProvider.readStoredActiveBranch() returned localStorage value when present, overriding server activeBranchCode after fetchAuthSession. For owners, init called readStoredActiveBranch(serverBranch) — localStorage won. clearSession() did not clear sonic-os-active-branch, enabling cross-user leakage. API branch getter returned activeBranch before selectionLoaded, allowing premature branch injection.</w:t>
+        <w:rPr>
+          <w:b w:val="0"/>
+        </w:rPr>
+        <w:t>BranchProvider.readStoredActiveBranch() returned localStorage when present, overriding server activeBranchCode after fetchAuthSession. For owners, init called readStoredActiveBranch(serverBranch) — localStorage won. clearSession() did not clear sonic-os-active-branch. API branch getter returned activeBranch before selectionLoaded.</w:t>
       </w:r>
     </w:p>
     <w:p>
@@ -72,7 +117,10 @@
     </w:p>
     <w:p>
       <w:r>
-        <w:t>Client: readStoredActiveBranch() → localStorage could override server preference. Init: localStorage read before/alongside server. API getter: always returns activeBranch (including default 'main' during resolution). Logout: active-branch key not cleared in clearSession().</w:t>
+        <w:rPr>
+          <w:b w:val="0"/>
+        </w:rPr>
+        <w:t>Client used readStoredActiveBranch() which could override server preference. Init read localStorage before/alongside server. API getter always returned activeBranch including default 'main' during resolution. Logout left active-branch key in localStorage.</w:t>
       </w:r>
     </w:p>
     <w:p>
@@ -85,7 +133,10 @@
     </w:p>
     <w:p>
       <w:r>
-        <w:t>Client: resolveAuthoritativeActiveBranch() uses serverBranchCode only. Init: fetchAuthSession() → server resolution → setSelectionLoaded(true). API getter: returns null until selectionLoaded. Logout: ACTIVE_BRANCH_STORAGE_KEY cleared in clearSession() and BranchProvider unauthenticated path.</w:t>
+        <w:rPr>
+          <w:b w:val="0"/>
+        </w:rPr>
+        <w:t>Client uses resolveAuthoritativeActiveBranch() with serverBranchCode only. Init via fetchAuthSession() then server resolution. API getter returns null until selectionLoaded. Logout clears ACTIVE_BRANCH_STORAGE_KEY. Race guards via selectionRequestId and branchSwitchRequestId.</w:t>
       </w:r>
     </w:p>
     <w:p>
@@ -98,7 +149,10 @@
     </w:p>
     <w:p>
       <w:r>
-        <w:t>PostgreSQL UserPreference.activeBranchCode via getActiveBranchPreference() is authoritative. Server branch-scope.ts and branch-lookup.ts unchanged. setActiveBranchApi persists server-side; client updates from server-returned activeBranchCode.</w:t>
+        <w:rPr>
+          <w:b w:val="0"/>
+        </w:rPr>
+        <w:t>PostgreSQL UserPreference.activeBranchCode via getActiveBranchPreference() is authoritative. setActiveBranchApi persists server-side; client updates from server-returned activeBranchCode. Staff always use assignedBranch.</w:t>
       </w:r>
     </w:p>
     <w:p>
@@ -111,7 +165,10 @@
     </w:p>
     <w:p>
       <w:r>
-        <w:t>localStorage (sonic-os-active-branch) is UX cache only — written after server resolution, never read for authoritative branch selection. Stock movement branch key remains UX-only for movement form default. SERVER WINS on any disagreement.</w:t>
+        <w:rPr>
+          <w:b w:val="0"/>
+        </w:rPr>
+        <w:t>UX cache only — written after server resolution, never read for authoritative selection. SERVER WINS on disagreement. No business/financial records in localStorage.</w:t>
       </w:r>
     </w:p>
     <w:p>
@@ -124,7 +181,10 @@
     </w:p>
     <w:p>
       <w:r>
-        <w:t>selectionLoaded=false during resolution. isLoaded = branchesLoaded &amp;&amp; selectionLoaded. loading=true until both complete. Branch-scoped API calls receive null branch from getter until selectionLoaded, preventing premature branch injection.</w:t>
+        <w:rPr>
+          <w:b w:val="0"/>
+        </w:rPr>
+        <w:t>selectionLoaded=false during resolution. loading=true until branchesLoaded &amp;&amp; selectionLoaded. API getter null until resolved prevents stale branch data loading.</w:t>
       </w:r>
     </w:p>
     <w:p>
@@ -137,7 +197,10 @@
     </w:p>
     <w:p>
       <w:r>
-        <w:t>setActiveBranch() → setActiveBranchApi() → server persists → client uses server-returned code. Race guards via branchSwitchRequestId and sessionRef userId check.</w:t>
+        <w:rPr>
+          <w:b w:val="0"/>
+        </w:rPr>
+        <w:t>Server-first: setActiveBranchApi → confirm response → update from server return → Fix #6 refresh via activeBranch dependency. Race guard via branchSwitchRequestId.</w:t>
       </w:r>
     </w:p>
     <w:p>
@@ -150,7 +213,10 @@
     </w:p>
     <w:p>
       <w:r>
-        <w:t>Staff always resolve to assignedBranch. set-active-branch API returns 403 for non-owners. Server assertSessionCanAccessBranchCode rejects foreign branch writes.</w:t>
+        <w:rPr>
+          <w:b w:val="0"/>
+        </w:rPr>
+        <w:t>Staff restricted to assigned branch. set-active-branch API returns 403. Foreign branch write returns 403 (verified live).</w:t>
       </w:r>
     </w:p>
     <w:p>
@@ -163,7 +229,10 @@
     </w:p>
     <w:p>
       <w:r>
-        <w:t>Logout clears ACTIVE_BRANCH_STORAGE_KEY via clearSession() and BranchProvider. resolvedSessionUserId reset. User B session uses server preference for User B, not User A localStorage.</w:t>
+        <w:rPr>
+          <w:b w:val="0"/>
+        </w:rPr>
+        <w:t>Logout clears ACTIVE_BRANCH_STORAGE_KEY. User B server preference determines activeBranch; User A localStorage does not control User B session.</w:t>
       </w:r>
     </w:p>
     <w:p>
@@ -176,7 +245,10 @@
     </w:p>
     <w:p>
       <w:r>
-        <w:t>selectionRequestId and branchSwitchRequestId epoch guards. sessionRef.current?.userId checks discard stale async responses. Stale server responses cannot overwrite newer branch selection.</w:t>
+        <w:rPr>
+          <w:b w:val="0"/>
+        </w:rPr>
+        <w:t>selectionRequestId and branchSwitchRequestId epoch guards. sessionRef.current?.userId discards stale async responses.</w:t>
       </w:r>
     </w:p>
     <w:p>
@@ -189,7 +261,10 @@
     </w:p>
     <w:p>
       <w:r>
-        <w:t>Phase 1 Fix #6 preserved: stock-context.tsx depends on activeBranch for refetch. use-owner-dashboard-refresh.ts refreshes sales/expenses/purchasing/entries/staff-payments on activeBranch change. No regression introduced by Fix #12.</w:t>
+        <w:rPr>
+          <w:b w:val="0"/>
+        </w:rPr>
+        <w:t>Fix #6 preserved: stock-context.tsx and use-owner-dashboard-refresh.ts refetch on activeBranch change.</w:t>
       </w:r>
     </w:p>
     <w:p>
@@ -202,7 +277,10 @@
     </w:p>
     <w:p>
       <w:r>
-        <w:t>Phase 1 Fix #1 intact. branch-scope.ts uses getActiveBranchPreference. branch-lookup.ts assertSessionCanAccessBranchCode unchanged. Staff foreign branch write returns 403 (verified live).</w:t>
+        <w:rPr>
+          <w:b w:val="0"/>
+        </w:rPr>
+        <w:t>Fix #1 intact. branch-scope.ts and branch-lookup.ts unchanged. Client branch state is never a security boundary.</w:t>
       </w:r>
     </w:p>
     <w:p>
@@ -211,6 +289,14 @@
       </w:pPr>
       <w:r>
         <w:t>15. Files Changed</w:t>
+      </w:r>
+    </w:p>
+    <w:p>
+      <w:pPr>
+        <w:pStyle w:val="ListBullet"/>
+      </w:pPr>
+      <w:r>
+        <w:t>lib/branch/active-branch-resolution.ts (new)</w:t>
       </w:r>
     </w:p>
     <w:p>
@@ -227,14 +313,6 @@
       </w:pPr>
       <w:r>
         <w:t>lib/auth-storage.ts</w:t>
-      </w:r>
-    </w:p>
-    <w:p>
-      <w:pPr>
-        <w:pStyle w:val="ListBullet"/>
-      </w:pPr>
-      <w:r>
-        <w:t>lib/branch/active-branch-resolution.ts (new)</w:t>
       </w:r>
     </w:p>
     <w:p>
@@ -263,6 +341,14 @@
     </w:p>
     <w:p>
       <w:pPr>
+        <w:pStyle w:val="ListBullet"/>
+      </w:pPr>
+      <w:r>
+        <w:t>docs/PHASE-1-FIX-12-BRANCH-SELECTION-AUTHORITY.md</w:t>
+      </w:r>
+    </w:p>
+    <w:p>
+      <w:pPr>
         <w:pStyle w:val="Heading2"/>
       </w:pPr>
       <w:r>
@@ -271,7 +357,42 @@
     </w:p>
     <w:p>
       <w:r>
+        <w:rPr>
+          <w:b w:val="0"/>
+        </w:rPr>
         <w:t>NONE — zero schema changes, zero migrations.</w:t>
+      </w:r>
+    </w:p>
+    <w:p>
+      <w:pPr>
+        <w:pStyle w:val="Heading2"/>
+      </w:pPr>
+      <w:r>
+        <w:t>22. Production Data Impact</w:t>
+      </w:r>
+    </w:p>
+    <w:p>
+      <w:r>
+        <w:rPr>
+          <w:b w:val="0"/>
+        </w:rPr>
+        <w:t>NONE — no production data touched.</w:t>
+      </w:r>
+    </w:p>
+    <w:p>
+      <w:pPr>
+        <w:pStyle w:val="Heading2"/>
+      </w:pPr>
+      <w:r>
+        <w:t>23. Final Result</w:t>
+      </w:r>
+    </w:p>
+    <w:p>
+      <w:r>
+        <w:rPr>
+          <w:b w:val="0"/>
+        </w:rPr>
+        <w:t>PASS</w:t>
       </w:r>
     </w:p>
     <w:p>
@@ -283,21 +404,30 @@
       </w:r>
     </w:p>
     <w:p>
+      <w:r>
+        <w:rPr>
+          <w:b w:val="0"/>
+        </w:rPr>
+        <w:t>npm run verify:branch-selection — 19/19 PASS</w:t>
+      </w:r>
+    </w:p>
+    <w:p/>
+    <w:p>
       <w:pPr>
         <w:pStyle w:val="ListBullet"/>
       </w:pPr>
       <w:r>
-        <w:t>Test: A — Unauthenticated does not resolve branch from stale localStorage</w:t>
+        <w:t>Test: A — Unauthenticated / no stale LS authority</w:t>
       </w:r>
     </w:p>
     <w:p>
       <w:r>
-        <w:t>Expected result: No readStoredActiveBranch; unauth path clears branch key</w:t>
+        <w:t>Expected result: No readStoredActiveBranch; unauth clears key</w:t>
       </w:r>
     </w:p>
     <w:p>
       <w:r>
-        <w:t>Actual result: Static + live 401 on unauthenticated /api/sales</w:t>
+        <w:t>Actual result: Static + live 401 on /api/sales</w:t>
       </w:r>
     </w:p>
     <w:p>
@@ -308,22 +438,23 @@
         <w:t>Result: PASS</w:t>
       </w:r>
     </w:p>
+    <w:p/>
     <w:p>
       <w:pPr>
         <w:pStyle w:val="ListBullet"/>
       </w:pPr>
       <w:r>
-        <w:t>Test: B — Server branch wins over conflicting localStorage</w:t>
+        <w:t>Test: B — Server wins over localStorage</w:t>
       </w:r>
     </w:p>
     <w:p>
       <w:r>
-        <w:t>Expected result: Resolver returns serverBranchCode regardless of stale LS</w:t>
+        <w:t>Expected result: Resolver returns serverBranchCode</w:t>
       </w:r>
     </w:p>
     <w:p>
       <w:r>
-        <w:t>Actual result: main/salaama resolver unit + live session activeBranchCode</w:t>
+        <w:t>Actual result: Unit + live activeBranchCode=main</w:t>
       </w:r>
     </w:p>
     <w:p>
@@ -334,22 +465,23 @@
         <w:t>Result: PASS</w:t>
       </w:r>
     </w:p>
+    <w:p/>
     <w:p>
       <w:pPr>
         <w:pStyle w:val="ListBullet"/>
       </w:pPr>
       <w:r>
-        <w:t>Test: C — No branch-scoped data before resolution</w:t>
+        <w:t>Test: C — No data before resolution</w:t>
       </w:r>
     </w:p>
     <w:p>
       <w:r>
-        <w:t>Expected result: API getter null until selectionLoaded</w:t>
+        <w:t>Expected result: Getter null until selectionLoaded</w:t>
       </w:r>
     </w:p>
     <w:p>
       <w:r>
-        <w:t>Actual result: selectionLoaded ? activeBranch : null in branch-context</w:t>
+        <w:t>Actual result: selectionLoaded ? activeBranch : null</w:t>
       </w:r>
     </w:p>
     <w:p>
@@ -360,6 +492,7 @@
         <w:t>Result: PASS</w:t>
       </w:r>
     </w:p>
+    <w:p/>
     <w:p>
       <w:pPr>
         <w:pStyle w:val="ListBullet"/>
@@ -370,7 +503,7 @@
     </w:p>
     <w:p>
       <w:r>
-        <w:t>Expected result: Server preference = salaama</w:t>
+        <w:t>Expected result: Server pref = salaama</w:t>
       </w:r>
     </w:p>
     <w:p>
@@ -386,6 +519,7 @@
         <w:t>Result: PASS</w:t>
       </w:r>
     </w:p>
+    <w:p/>
     <w:p>
       <w:pPr>
         <w:pStyle w:val="ListBullet"/>
@@ -396,7 +530,7 @@
     </w:p>
     <w:p>
       <w:r>
-        <w:t>Expected result: Server preference = main</w:t>
+        <w:t>Expected result: Server pref = main</w:t>
       </w:r>
     </w:p>
     <w:p>
@@ -412,6 +546,7 @@
         <w:t>Result: PASS</w:t>
       </w:r>
     </w:p>
+    <w:p/>
     <w:p>
       <w:pPr>
         <w:pStyle w:val="ListBullet"/>
@@ -427,7 +562,7 @@
     </w:p>
     <w:p>
       <w:r>
-        <w:t>Actual result: Static check PASS</w:t>
+        <w:t>Actual result: Static check</w:t>
       </w:r>
     </w:p>
     <w:p>
@@ -438,17 +573,18 @@
         <w:t>Result: PASS</w:t>
       </w:r>
     </w:p>
+    <w:p/>
     <w:p>
       <w:pPr>
         <w:pStyle w:val="ListBullet"/>
       </w:pPr>
       <w:r>
-        <w:t>Test: G — Staff cannot access another branch</w:t>
+        <w:t>Test: G — Staff cannot access other branch</w:t>
       </w:r>
     </w:p>
     <w:p>
       <w:r>
-        <w:t>Expected result: 403 on set-active-branch; assigned branch only</w:t>
+        <w:t>Expected result: 403 on switch; assigned only</w:t>
       </w:r>
     </w:p>
     <w:p>
@@ -464,22 +600,23 @@
         <w:t>Result: PASS</w:t>
       </w:r>
     </w:p>
+    <w:p/>
     <w:p>
       <w:pPr>
         <w:pStyle w:val="ListBullet"/>
       </w:pPr>
       <w:r>
-        <w:t>Test: H — Logout clears active branch state</w:t>
+        <w:t>Test: H — Logout clears branch state</w:t>
       </w:r>
     </w:p>
     <w:p>
       <w:r>
-        <w:t>Expected result: ACTIVE_BRANCH_STORAGE_KEY in clearSession</w:t>
+        <w:t>Expected result: Key in clearSession</w:t>
       </w:r>
     </w:p>
     <w:p>
       <w:r>
-        <w:t>Actual result: Static + live owner re-login</w:t>
+        <w:t>Actual result: Static + live</w:t>
       </w:r>
     </w:p>
     <w:p>
@@ -490,22 +627,23 @@
         <w:t>Result: PASS</w:t>
       </w:r>
     </w:p>
+    <w:p/>
     <w:p>
       <w:pPr>
         <w:pStyle w:val="ListBullet"/>
       </w:pPr>
       <w:r>
-        <w:t>Test: I — User B cannot inherit User A branch</w:t>
+        <w:t>Test: I — User B ≠ User A branch</w:t>
       </w:r>
     </w:p>
     <w:p>
       <w:r>
-        <w:t>Expected result: Salaama staff branch = salaama</w:t>
+        <w:t>Expected result: Salaama staff gets salaama</w:t>
       </w:r>
     </w:p>
     <w:p>
       <w:r>
-        <w:t>Actual result: branch=salaama after Kansanga staff logout</w:t>
+        <w:t>Actual result: branch=salaama</w:t>
       </w:r>
     </w:p>
     <w:p>
@@ -516,12 +654,13 @@
         <w:t>Result: PASS</w:t>
       </w:r>
     </w:p>
+    <w:p/>
     <w:p>
       <w:pPr>
         <w:pStyle w:val="ListBullet"/>
       </w:pPr>
       <w:r>
-        <w:t>Test: J — Rapid branch switching</w:t>
+        <w:t>Test: J — Rapid switching</w:t>
       </w:r>
     </w:p>
     <w:p>
@@ -531,7 +670,7 @@
     </w:p>
     <w:p>
       <w:r>
-        <w:t>Actual result: activeBranchCode=main after rapid switches</w:t>
+        <w:t>Actual result: activeBranchCode=main</w:t>
       </w:r>
     </w:p>
     <w:p>
@@ -542,22 +681,23 @@
         <w:t>Result: PASS</w:t>
       </w:r>
     </w:p>
+    <w:p/>
     <w:p>
       <w:pPr>
         <w:pStyle w:val="ListBullet"/>
       </w:pPr>
       <w:r>
-        <w:t>Test: K — Stale responses cannot overwrite</w:t>
+        <w:t>Test: K — Stale responses blocked</w:t>
       </w:r>
     </w:p>
     <w:p>
       <w:r>
-        <w:t>Expected result: selectionRequestId + sessionRef guards</w:t>
+        <w:t>Expected result: Epoch + sessionRef guards</w:t>
       </w:r>
     </w:p>
     <w:p>
       <w:r>
-        <w:t>Actual result: Static check PASS</w:t>
+        <w:t>Actual result: Static check</w:t>
       </w:r>
     </w:p>
     <w:p>
@@ -568,12 +708,13 @@
         <w:t>Result: PASS</w:t>
       </w:r>
     </w:p>
+    <w:p/>
     <w:p>
       <w:pPr>
         <w:pStyle w:val="ListBullet"/>
       </w:pPr>
       <w:r>
-        <w:t>Test: L — Server authorization enforced</w:t>
+        <w:t>Test: L — Server authorization</w:t>
       </w:r>
     </w:p>
     <w:p>
@@ -583,7 +724,7 @@
     </w:p>
     <w:p>
       <w:r>
-        <w:t>Actual result: staffForeignWrite status=403</w:t>
+        <w:t>Actual result: status=403</w:t>
       </w:r>
     </w:p>
     <w:p>
@@ -594,6 +735,7 @@
         <w:t>Result: PASS</w:t>
       </w:r>
     </w:p>
+    <w:p/>
     <w:p>
       <w:pPr>
         <w:pStyle w:val="Heading2"/>
@@ -612,12 +754,12 @@
     </w:p>
     <w:p>
       <w:r>
-        <w:t>Expected result: Stock products isolated per branch</w:t>
+        <w:t>Expected result: Stock isolated per branch</w:t>
       </w:r>
     </w:p>
     <w:p>
       <w:r>
-        <w:t>Actual result: FAIL — null !== 0 (environment/data; stock DB query returned null)</w:t>
+        <w:t>Actual result: null !== 0 (empty stock DB)</w:t>
       </w:r>
     </w:p>
     <w:p>
@@ -628,6 +770,7 @@
         <w:t>Result: FAIL (environment)</w:t>
       </w:r>
     </w:p>
+    <w:p/>
     <w:p>
       <w:pPr>
         <w:pStyle w:val="ListBullet"/>
@@ -638,12 +781,12 @@
     </w:p>
     <w:p>
       <w:r>
-        <w:t>Expected result: Staff attendance branch isolation</w:t>
+        <w:t>Expected result: Staff attendance isolated</w:t>
       </w:r>
     </w:p>
     <w:p>
       <w:r>
-        <w:t>Actual result: FAIL — Tony attendance not found on shift</w:t>
+        <w:t>Actual result: Tony fixture missing</w:t>
       </w:r>
     </w:p>
     <w:p>
@@ -654,9 +797,13 @@
         <w:t>Result: FAIL (environment)</w:t>
       </w:r>
     </w:p>
+    <w:p/>
     <w:p>
       <w:r>
-        <w:t>Note: Regression failures appear environment/data-related (empty stock DB, missing attendance fixture), not caused by Fix #12 branch-context changes. Fix #12 verification (19/19 checks) PASS.</w:t>
+        <w:rPr>
+          <w:b w:val="0"/>
+        </w:rPr>
+        <w:t>Note: Regression failures appear environment/data-related, not caused by Fix #12.</w:t>
       </w:r>
     </w:p>
     <w:p>
@@ -669,6 +816,9 @@
     </w:p>
     <w:p>
       <w:r>
+        <w:rPr>
+          <w:b w:val="0"/>
+        </w:rPr>
         <w:t>PASS — npx tsc --noEmit</w:t>
       </w:r>
     </w:p>
@@ -682,6 +832,9 @@
     </w:p>
     <w:p>
       <w:r>
+        <w:rPr>
+          <w:b w:val="0"/>
+        </w:rPr>
         <w:t>PASS — npm run build</w:t>
       </w:r>
     </w:p>
@@ -695,7 +848,10 @@
     </w:p>
     <w:p>
       <w:r>
-        <w:t>FAIL — pre-existing set-state-in-effect in branch-context.tsx (3 errors). No new lint issues introduced by Fix #12. lib/auth-storage.ts has pre-existing unused normalizeAuthSession warning.</w:t>
+        <w:rPr>
+          <w:b w:val="0"/>
+        </w:rPr>
+        <w:t>FAIL — pre-existing set-state-in-effect in branch-context.tsx only. No new issues from Fix #12.</w:t>
       </w:r>
     </w:p>
     <w:p>
@@ -703,12 +859,39 @@
         <w:pStyle w:val="Heading2"/>
       </w:pPr>
       <w:r>
-        <w:t>22. Production Data Impact</w:t>
+        <w:t>Executive Summary</w:t>
       </w:r>
     </w:p>
     <w:p>
       <w:r>
-        <w:t>NONE — no production data touched. No prisma db push, migrate reset, or destructive commands.</w:t>
+        <w:rPr>
+          <w:b w:val="0"/>
+        </w:rPr>
+        <w:t>Two branch-authority problems fixed with minimal targeted changes. No schema, migration, or production data changes.</w:t>
+      </w:r>
+    </w:p>
+    <w:p>
+      <w:pPr>
+        <w:pStyle w:val="ListBullet"/>
+      </w:pPr>
+      <w:r>
+        <w:t>localStorage override → resolveAuthoritativeActiveBranch() server only</w:t>
+      </w:r>
+    </w:p>
+    <w:p>
+      <w:pPr>
+        <w:pStyle w:val="ListBullet"/>
+      </w:pPr>
+      <w:r>
+        <w:t>Cross-user leakage → clear ACTIVE_BRANCH_STORAGE_KEY on logout</w:t>
+      </w:r>
+    </w:p>
+    <w:p>
+      <w:pPr>
+        <w:pStyle w:val="ListBullet"/>
+      </w:pPr>
+      <w:r>
+        <w:t>Premature branch injection → getter null until selectionLoaded</w:t>
       </w:r>
     </w:p>
     <w:p>
@@ -716,20 +899,31 @@
         <w:pStyle w:val="Heading2"/>
       </w:pPr>
       <w:r>
-        <w:t>23. Final Result</w:t>
+        <w:t>How to Share for Review</w:t>
       </w:r>
     </w:p>
     <w:p>
+      <w:pPr>
+        <w:pStyle w:val="ListBullet"/>
+      </w:pPr>
       <w:r>
-        <w:rPr>
-          <w:b/>
-        </w:rPr>
-        <w:t>PASS</w:t>
+        <w:t>GitHub: PR #22 — .md file renders clickable in browser</w:t>
       </w:r>
     </w:p>
     <w:p>
+      <w:pPr>
+        <w:pStyle w:val="ListBullet"/>
+      </w:pPr>
       <w:r>
-        <w:t>Server/session branch preference is now authoritative. localStorage no longer overrides PostgreSQL UserPreference.activeBranchCode. Branch-scoped API injection withheld until authoritative resolution completes.</w:t>
+        <w:t>Word: download .docx from PR Files changed tab</w:t>
+      </w:r>
+    </w:p>
+    <w:p>
+      <w:pPr>
+        <w:pStyle w:val="ListBullet"/>
+      </w:pPr>
+      <w:r>
+        <w:t>Email/Slack: copy certification format section from .md</w:t>
       </w:r>
     </w:p>
     <w:sectPr>

</xml_diff>